<commit_message>
docs: complete AI collaboration cases after Claude review
</commit_message>
<xml_diff>
--- a/submission/과제2_2026521505_최근일_최종.docx
+++ b/submission/과제2_2026521505_최근일_최종.docx
@@ -1607,7 +1607,7 @@
         <w:rPr>
           <w:b w:val="0"/>
         </w:rPr>
-        <w:t>기존 DSD 읽기·점검 모듈을 분리하고 AI 코딩 도구를 활용하여 파일 입력, 결과 탐색, 원문 연결과 내보내기 기능을 구현하였다. 구현 과정에서 발견한 화면 오류를 다음과 같이 수정하였다.</w:t>
+        <w:t>Codex와 함께 기존 DSD 읽기·점검 엔진을 재사용하고 브라우저에서 실행하는 정적 웹 앱으로 구조를 정한 뒤, 파일 입력, 결과 탐색, 원문 연결과 내보내기 기능을 구현하였다. 구현 과정에서 발견한 문제를 다음과 같이 수정하였다.</w:t>
       </w:r>
     </w:p>
     <w:p>
@@ -1626,7 +1626,7 @@
         <w:rPr>
           <w:b w:val="0"/>
         </w:rPr>
-        <w:t>원문 위치로 이동할 때 화면 전체가 스크롤되어 제목과 닫기 버튼이 화면 밖으로 밀리는 문제가 발생하였다. 원문 패널 내부에서만 이동하도록 수정 기준을 정하고, AI가 제안한 방식에 따라 내부 스크롤과 창의 초기 위치를 조정하였다. 수정 후에는 원문으로 이동해도 제목과 닫기 버튼이 유지되었다.</w:t>
+        <w:t>원문 위치로 이동할 때 화면 전체가 스크롤되어 제목과 닫기 버튼이 화면 밖으로 밀리는 문제가 발생하였다. 제목과 닫기 버튼이 유지되도록 근거 창의 동작을 재현하고 수정하는 작업을 Codex에 맡겼다. Codex는 원문을 찾는 스크롤이 바깥 창까지 움직이는 것을 확인하고, 원문 패널 안에서만 이동하도록 제안하였다. 내부 스크롤과 창의 초기 위치를 조정한 뒤에는 원문으로 이동해도 제목과 닫기 버튼이 유지되었다.</w:t>
       </w:r>
     </w:p>
     <w:p>
@@ -1645,7 +1645,7 @@
         <w:rPr>
           <w:b w:val="0"/>
         </w:rPr>
-        <w:t>문서를 비운 뒤에도 화면 내부에 이전 문서의 텍스트와 이벤트가 남아 있었다. 파일 교체와 초기화 경로를 함께 확인한 뒤, 결과를 숨기는 대신 상태 값·결과 행·근거·헤더·원문을 공통 함수에서 제거하도록 변경하였다. 문서 비우기와 새 파일 읽기 실패 경로에 같은 처리를 적용하고, 재발 방지 시험 2개를 추가하였다.</w:t>
+        <w:t>문서를 비운 뒤에도 화면 내부에 이전 문서의 텍스트와 이벤트가 남아 있었다. Codex에 문서 비우기와 파일 교체 시 초기화 경로를 검토하도록 요청하였고, 검토 과정에서 남은 내용을 재현하였다. 제안된 공통 초기화 함수를 적용하여 상태 값·결과 행·근거·헤더·원문을 함께 제거하였다. 문서 비우기와 새 파일 읽기 실패 경로에 같은 처리를 적용하고, 재발 방지 시험 2개를 추가하였다. 두 시험은 수정 전에는 실패하고 수정 후에는 통과하였으며, 브라우저에서도 이전 문서의 텍스트가 남지 않았다.</w:t>
       </w:r>
     </w:p>
     <w:p>
@@ -1664,7 +1664,7 @@
         <w:rPr>
           <w:b w:val="0"/>
         </w:rPr>
-        <w:t>좁은 화면에서 결과 표가 나타나면 페이지 폭이 582px로 늘어나는 문제가 발생하였다. AI와 함께 표와 바깥 배치의 최소 폭을 확인하고, 페이지는 화면 폭에 맞추되 표 내부만 가로 스크롤하도록 수정하였다. 기존 재시험에서 페이지 폭이 375px로 맞춰졌으며, 최신 화면에서도 390px 폭으로 결과와 주요 조작을 확인하였다.</w:t>
+        <w:t>좁은 화면에서 결과 표가 나타나면 페이지 폭이 582px로 늘어나는 문제가 발생하였다. Codex에 첫 화면과 결과 화면의 폭을 비교해 넘침의 원인을 찾도록 요청하였다. Codex는 표와 바깥 배치의 최소 폭을 원인으로 좁히고, 페이지 폭을 화면에 맞추면서 표 내부만 가로 스크롤하도록 제안하였다. 이를 적용한 재시험에서 페이지 폭이 375px로 맞춰졌으며, 최신 화면에서도 390px 폭으로 결과와 주요 조작을 확인하였다.</w:t>
       </w:r>
     </w:p>
     <w:p>

</xml_diff>